<commit_message>
Add Render deployment blueprint
</commit_message>
<xml_diff>
--- a/docs/FSD.docx
+++ b/docs/FSD.docx
@@ -93,7 +93,7 @@
               </w:rPr>
               <w:t>Update</w:t>
               <w:br/>
-              <w:t>2026-07-05</w:t>
+              <w:t>2026-07-06</w:t>
             </w:r>
           </w:p>
         </w:tc>
@@ -1445,6 +1445,59 @@
     </w:p>
     <w:p>
       <w:pPr>
+        <w:pStyle w:val="Heading2"/>
+      </w:pPr>
+      <w:r>
+        <w:t>4.10 Hosting Publik Render</w:t>
+      </w:r>
+    </w:p>
+    <w:p>
+      <w:pPr>
+        <w:pStyle w:val="ListBullet"/>
+        <w:spacing w:before="0" w:after="80" w:line="300" w:lineRule="auto"/>
+      </w:pPr>
+      <w:r>
+        <w:t>Aplikasi dapat dipublikasikan sebagai satu Web Service Node.js melalui Blueprint render.yaml.</w:t>
+      </w:r>
+    </w:p>
+    <w:p>
+      <w:pPr>
+        <w:pStyle w:val="ListBullet"/>
+        <w:spacing w:before="0" w:after="80" w:line="300" w:lineRule="auto"/>
+      </w:pPr>
+      <w:r>
+        <w:t>Render memberikan domain publik acak *.onrender.com tanpa halaman verifikasi pengunjung.</w:t>
+      </w:r>
+    </w:p>
+    <w:p>
+      <w:pPr>
+        <w:pStyle w:val="ListBullet"/>
+        <w:spacing w:before="0" w:after="80" w:line="300" w:lineRule="auto"/>
+      </w:pPr>
+      <w:r>
+        <w:t>Konfigurasi memakai paket gratis, region Singapura, health check /api/health, dan auto-deploy branch main.</w:t>
+      </w:r>
+    </w:p>
+    <w:p>
+      <w:pPr>
+        <w:pStyle w:val="ListBullet"/>
+        <w:spacing w:before="0" w:after="80" w:line="300" w:lineRule="auto"/>
+      </w:pPr>
+      <w:r>
+        <w:t>Password Admin, Manager, dan Cashier diisi sebagai secret saat Blueprint dibuat dan tidak disimpan di repository.</w:t>
+      </w:r>
+    </w:p>
+    <w:p>
+      <w:pPr>
+        <w:pStyle w:val="ListBullet"/>
+        <w:spacing w:before="0" w:after="80" w:line="300" w:lineRule="auto"/>
+      </w:pPr>
+      <w:r>
+        <w:t>Hosting gratis ditujukan untuk demo; SQLite dan gambar Data URL berada pada filesystem sementara sehingga data dapat kembali ke seed awal setelah sleep, restart, atau redeploy.</w:t>
+      </w:r>
+    </w:p>
+    <w:p>
+      <w:pPr>
         <w:pStyle w:val="Heading1"/>
       </w:pPr>
       <w:r>
@@ -1597,6 +1650,68 @@
                 <w:sz w:val="19"/>
               </w:rPr>
               <w:t>Perubahan</w:t>
+            </w:r>
+          </w:p>
+        </w:tc>
+      </w:tr>
+      <w:tr>
+        <w:tc>
+          <w:tcPr>
+            <w:tcW w:type="dxa" w:w="1944"/>
+            <w:tcMar>
+              <w:top w:w="80" w:type="dxa"/>
+              <w:start w:w="120" w:type="dxa"/>
+              <w:bottom w:w="80" w:type="dxa"/>
+              <w:end w:w="120" w:type="dxa"/>
+            </w:tcMar>
+            <w:tcBorders>
+              <w:top w:val="single" w:sz="6" w:space="0" w:color="D9E2EC"/>
+              <w:left w:val="single" w:sz="6" w:space="0" w:color="D9E2EC"/>
+              <w:bottom w:val="single" w:sz="6" w:space="0" w:color="D9E2EC"/>
+              <w:right w:val="single" w:sz="6" w:space="0" w:color="D9E2EC"/>
+            </w:tcBorders>
+          </w:tcPr>
+          <w:p>
+            <w:pPr>
+              <w:spacing w:before="0" w:after="0" w:line="276" w:lineRule="auto"/>
+            </w:pPr>
+            <w:r>
+              <w:rPr>
+                <w:rFonts w:ascii="Calibri" w:hAnsi="Calibri" w:eastAsia="Calibri"/>
+                <w:color w:val="1F2937"/>
+                <w:sz w:val="19"/>
+              </w:rPr>
+              <w:t>2026-07-06</w:t>
+            </w:r>
+          </w:p>
+        </w:tc>
+        <w:tc>
+          <w:tcPr>
+            <w:tcW w:type="dxa" w:w="7416"/>
+            <w:tcMar>
+              <w:top w:w="80" w:type="dxa"/>
+              <w:start w:w="120" w:type="dxa"/>
+              <w:bottom w:w="80" w:type="dxa"/>
+              <w:end w:w="120" w:type="dxa"/>
+            </w:tcMar>
+            <w:tcBorders>
+              <w:top w:val="single" w:sz="6" w:space="0" w:color="D9E2EC"/>
+              <w:left w:val="single" w:sz="6" w:space="0" w:color="D9E2EC"/>
+              <w:bottom w:val="single" w:sz="6" w:space="0" w:color="D9E2EC"/>
+              <w:right w:val="single" w:sz="6" w:space="0" w:color="D9E2EC"/>
+            </w:tcBorders>
+          </w:tcPr>
+          <w:p>
+            <w:pPr>
+              <w:spacing w:before="0" w:after="0" w:line="276" w:lineRule="auto"/>
+            </w:pPr>
+            <w:r>
+              <w:rPr>
+                <w:rFonts w:ascii="Calibri" w:hAnsi="Calibri" w:eastAsia="Calibri"/>
+                <w:color w:val="1F2937"/>
+                <w:sz w:val="19"/>
+              </w:rPr>
+              <w:t>Menambahkan Blueprint Render untuk hosting publik gratis, domain onrender.com, secret credential saat deploy, health check, auto-deploy, dan batasan penyimpanan SQLite sementara.</w:t>
             </w:r>
           </w:p>
         </w:tc>
@@ -2309,7 +2424,7 @@
         <w:color w:val="667085"/>
         <w:sz w:val="17"/>
       </w:rPr>
-      <w:t>Franchise Ordering Platform · FSD · Update 2026-07-05</w:t>
+      <w:t>Franchise Ordering Platform · FSD · Update 2026-07-06</w:t>
     </w:r>
   </w:p>
 </w:ftr>

</xml_diff>

<commit_message>
Migrate deployment to Netlify Postgres
</commit_message>
<xml_diff>
--- a/docs/FSD.docx
+++ b/docs/FSD.docx
@@ -1448,7 +1448,7 @@
         <w:pStyle w:val="Heading2"/>
       </w:pPr>
       <w:r>
-        <w:t>4.10 Hosting Publik Render</w:t>
+        <w:t>4.10 Hosting Publik Netlify</w:t>
       </w:r>
     </w:p>
     <w:p>
@@ -1457,7 +1457,7 @@
         <w:spacing w:before="0" w:after="80" w:line="300" w:lineRule="auto"/>
       </w:pPr>
       <w:r>
-        <w:t>Aplikasi dapat dipublikasikan sebagai satu Web Service Node.js melalui Blueprint render.yaml.</w:t>
+        <w:t>Aplikasi dipublikasikan melalui Netlify dengan domain *.netlify.app tanpa verifikasi pengunjung atau kartu kredit pada paket Free.</w:t>
       </w:r>
     </w:p>
     <w:p>
@@ -1466,7 +1466,7 @@
         <w:spacing w:before="0" w:after="80" w:line="300" w:lineRule="auto"/>
       </w:pPr>
       <w:r>
-        <w:t>Render memberikan domain publik acak *.onrender.com tanpa halaman verifikasi pengunjung.</w:t>
+        <w:t>Frontend Vite dilayani CDN, sedangkan route /api/* dijalankan sebagai Express Netlify Function.</w:t>
       </w:r>
     </w:p>
     <w:p>
@@ -1475,7 +1475,7 @@
         <w:spacing w:before="0" w:after="80" w:line="300" w:lineRule="auto"/>
       </w:pPr>
       <w:r>
-        <w:t>Konfigurasi memakai paket gratis, region Singapura, health check /api/health, dan auto-deploy branch main.</w:t>
+        <w:t>Netlify Database menyediakan PostgreSQL persisten untuk akun, produk, pesanan, inventory, laporan, RBAC, dan pengaturan franchise.</w:t>
       </w:r>
     </w:p>
     <w:p>
@@ -1484,7 +1484,7 @@
         <w:spacing w:before="0" w:after="80" w:line="300" w:lineRule="auto"/>
       </w:pPr>
       <w:r>
-        <w:t>Password Admin, Manager, dan Cashier diisi sebagai secret saat Blueprint dibuat dan tidak disimpan di repository.</w:t>
+        <w:t>Migration database dijalankan otomatis sebelum production deploy dipublikasikan.</w:t>
       </w:r>
     </w:p>
     <w:p>
@@ -1493,7 +1493,16 @@
         <w:spacing w:before="0" w:after="80" w:line="300" w:lineRule="auto"/>
       </w:pPr>
       <w:r>
-        <w:t>Hosting gratis ditujukan untuk demo; SQLite dan gambar Data URL berada pada filesystem sementara sehingga data dapat kembali ke seed awal setelah sleep, restart, atau redeploy.</w:t>
+        <w:t>Password Admin, Manager, Cashier, dan JWT secret disimpan sebagai environment variable Netlify dan tidak masuk repository.</w:t>
+      </w:r>
+    </w:p>
+    <w:p>
+      <w:pPr>
+        <w:pStyle w:val="ListBullet"/>
+        <w:spacing w:before="0" w:after="80" w:line="300" w:lineRule="auto"/>
+      </w:pPr>
+      <w:r>
+        <w:t>Paket Free memakai batas 300 kredit per bulan; project pause jika batas habis dan aktif kembali pada periode berikutnya.</w:t>
       </w:r>
     </w:p>
     <w:p>
@@ -1650,6 +1659,68 @@
                 <w:sz w:val="19"/>
               </w:rPr>
               <w:t>Perubahan</w:t>
+            </w:r>
+          </w:p>
+        </w:tc>
+      </w:tr>
+      <w:tr>
+        <w:tc>
+          <w:tcPr>
+            <w:tcW w:type="dxa" w:w="1944"/>
+            <w:tcMar>
+              <w:top w:w="80" w:type="dxa"/>
+              <w:start w:w="120" w:type="dxa"/>
+              <w:bottom w:w="80" w:type="dxa"/>
+              <w:end w:w="120" w:type="dxa"/>
+            </w:tcMar>
+            <w:tcBorders>
+              <w:top w:val="single" w:sz="6" w:space="0" w:color="D9E2EC"/>
+              <w:left w:val="single" w:sz="6" w:space="0" w:color="D9E2EC"/>
+              <w:bottom w:val="single" w:sz="6" w:space="0" w:color="D9E2EC"/>
+              <w:right w:val="single" w:sz="6" w:space="0" w:color="D9E2EC"/>
+            </w:tcBorders>
+          </w:tcPr>
+          <w:p>
+            <w:pPr>
+              <w:spacing w:before="0" w:after="0" w:line="276" w:lineRule="auto"/>
+            </w:pPr>
+            <w:r>
+              <w:rPr>
+                <w:rFonts w:ascii="Calibri" w:hAnsi="Calibri" w:eastAsia="Calibri"/>
+                <w:color w:val="1F2937"/>
+                <w:sz w:val="19"/>
+              </w:rPr>
+              <w:t>2026-07-06</w:t>
+            </w:r>
+          </w:p>
+        </w:tc>
+        <w:tc>
+          <w:tcPr>
+            <w:tcW w:type="dxa" w:w="7416"/>
+            <w:tcMar>
+              <w:top w:w="80" w:type="dxa"/>
+              <w:start w:w="120" w:type="dxa"/>
+              <w:bottom w:w="80" w:type="dxa"/>
+              <w:end w:w="120" w:type="dxa"/>
+            </w:tcMar>
+            <w:tcBorders>
+              <w:top w:val="single" w:sz="6" w:space="0" w:color="D9E2EC"/>
+              <w:left w:val="single" w:sz="6" w:space="0" w:color="D9E2EC"/>
+              <w:bottom w:val="single" w:sz="6" w:space="0" w:color="D9E2EC"/>
+              <w:right w:val="single" w:sz="6" w:space="0" w:color="D9E2EC"/>
+            </w:tcBorders>
+          </w:tcPr>
+          <w:p>
+            <w:pPr>
+              <w:spacing w:before="0" w:after="0" w:line="276" w:lineRule="auto"/>
+            </w:pPr>
+            <w:r>
+              <w:rPr>
+                <w:rFonts w:ascii="Calibri" w:hAnsi="Calibri" w:eastAsia="Calibri"/>
+                <w:color w:val="1F2937"/>
+                <w:sz w:val="19"/>
+              </w:rPr>
+              <w:t>Memigrasikan hosting ke Netlify Free, Express ke Netlify Functions, SQLite ke Netlify Database/PostgreSQL persisten, migration otomatis, routing SPA/API, dan emulator lokal Vite.</w:t>
             </w:r>
           </w:p>
         </w:tc>

</xml_diff>

<commit_message>
feat: update project codebase with database migrations, multi-outlet payment features, e2e tests, and updated documentation
</commit_message>
<xml_diff>
--- a/docs/FSD.docx
+++ b/docs/FSD.docx
@@ -93,7 +93,7 @@
               </w:rPr>
               <w:t>Update</w:t>
               <w:br/>
-              <w:t>2026-07-06</w:t>
+              <w:t>2026-07-12</w:t>
             </w:r>
           </w:p>
         </w:tc>
@@ -140,7 +140,7 @@
         <w:spacing w:before="0" w:after="120" w:line="300" w:lineRule="auto"/>
       </w:pPr>
       <w:r>
-        <w:t>Aplikasi ini menyediakan website pemesanan online yang dapat dikustom untuk berbagai franchise makanan/minuman. Tidak ada identitas brand yang dikunci ke satu nama; manager dapat mengubah identitas usaha, konten landing page, warna, kontak, gambar, dan prefix nomor pesanan.</w:t>
+        <w:t>Aplikasi ini dirancang sebagai platform pemesanan online yang dapat dipakai oleh berbagai franchise makanan dan minuman. Identitas toko tidak dikunci pada satu brand. Manager dapat menyesuaikan identitas usaha, konten landing page, warna, kontak, gambar, dan prefix nomor pesanan tanpa perlu mengubah kode aplikasi.</w:t>
       </w:r>
     </w:p>
     <w:tbl>
@@ -197,7 +197,7 @@
                 <w:color w:val="1F2937"/>
                 <w:sz w:val="20"/>
               </w:rPr>
-              <w:t>Satu aplikasi dapat digunakan oleh banyak brand/franchise dengan mengganti data konfigurasi, produk, promosi, dan tampilan publik.</w:t>
+              <w:t>Satu aplikasi dapat digunakan oleh banyak brand atau franchise dengan menyesuaikan konfigurasi, produk, promosi, dan tampilan publik.</w:t>
             </w:r>
           </w:p>
         </w:tc>
@@ -348,7 +348,7 @@
                 <w:color w:val="1F2937"/>
                 <w:sz w:val="19"/>
               </w:rPr>
-              <w:t>Registrasi/login, melihat menu dan promosi, memilih add-on produk, checkout, dan melacak status pesanan.</w:t>
+              <w:t>Memilih outlet, membuat akun atau login, memilih menu/add-on, menyelesaikan checkout tunai atau online, serta melacak pesanan dan pembayaran.</w:t>
             </w:r>
           </w:p>
         </w:tc>
@@ -410,7 +410,7 @@
                 <w:color w:val="1F2937"/>
                 <w:sz w:val="19"/>
               </w:rPr>
-              <w:t>Login cashier, melihat pesanan masuk, mengubah status pesanan, serta memantau ringkasan order dan total penjualan.</w:t>
+              <w:t>Memproses pesanan dan ringkasan operasional hanya dari outlet tempat akunnya ditugaskan.</w:t>
             </w:r>
           </w:p>
         </w:tc>
@@ -472,7 +472,7 @@
                 <w:color w:val="1F2937"/>
                 <w:sz w:val="19"/>
               </w:rPr>
-              <w:t>Mengelola kategori menu, produk dan add-on, promosi, cashier, inventory, Report operasional/keuangan, stasiun cashier, serta pengaturan franchise.</w:t>
+              <w:t>Mengelola outlet, kategori, produk, promosi, penempatan cashier, inventory, Report, stasiun Cashier, serta pengaturan franchise.</w:t>
             </w:r>
           </w:p>
         </w:tc>
@@ -534,7 +534,7 @@
                 <w:color w:val="1F2937"/>
                 <w:sz w:val="19"/>
               </w:rPr>
-              <w:t>Secara default mengakses seluruh modul operasional dan mengelola RBAC untuk menentukan modul yang boleh dibuka Cashier, Manager, dan Admin.</w:t>
+              <w:t>Masuk melalui /admin, mengakses seluruh modul termasuk Outlet, dan mengatur RBAC untuk setiap role.</w:t>
             </w:r>
           </w:p>
         </w:tc>
@@ -554,7 +554,7 @@
         <w:spacing w:before="0" w:after="120" w:line="300" w:lineRule="auto"/>
       </w:pPr>
       <w:r>
-        <w:t>Manager dapat mengubah elemen brand dan konten toko tanpa mengubah kode aplikasi.</w:t>
+        <w:t>Manager dapat menyesuaikan identitas brand dan konten toko dari pengaturan franchise tanpa perlu mengubah kode aplikasi.</w:t>
       </w:r>
     </w:p>
     <w:tbl>
@@ -942,7 +942,7 @@
                 <w:color w:val="1F2937"/>
                 <w:sz w:val="19"/>
               </w:rPr>
-              <w:t>Perubahan langsung memengaruhi halaman toko, login, cashier, tracking, dan manager.</w:t>
+              <w:t>Setelah disimpan, perubahan langsung diterapkan pada toko, login, Cashier, pelacakan pesanan, dan dashboard Manager/Admin.</w:t>
             </w:r>
           </w:p>
         </w:tc>
@@ -980,7 +980,7 @@
         <w:spacing w:before="0" w:after="80" w:line="300" w:lineRule="auto"/>
       </w:pPr>
       <w:r>
-        <w:t>Katalog mengambil produk aktif dari backend.</w:t>
+        <w:t>Katalog mengambil produk yang aktif, ditugaskan, dan tersedia pada outlet yang sedang dipilih pelanggan.</w:t>
       </w:r>
     </w:p>
     <w:p>
@@ -1025,6 +1025,24 @@
       </w:pPr>
       <w:r>
         <w:t>Setiap kategori memiliki nama, emoji/icon, urutan tampil, dan status aktif.</w:t>
+      </w:r>
+    </w:p>
+    <w:p>
+      <w:pPr>
+        <w:pStyle w:val="ListBullet"/>
+        <w:spacing w:before="0" w:after="80" w:line="300" w:lineRule="auto"/>
+      </w:pPr>
+      <w:r>
+        <w:t>Dashboard menampilkan kategori dalam kartu yang ringan dan responsif, lengkap dengan ikon, urutan, jumlah produk terkait, serta status visibilitas.</w:t>
+      </w:r>
+    </w:p>
+    <w:p>
+      <w:pPr>
+        <w:pStyle w:val="ListBullet"/>
+        <w:spacing w:before="0" w:after="80" w:line="300" w:lineRule="auto"/>
+      </w:pPr>
+      <w:r>
+        <w:t>Area tindakan memakai permukaan berwarna lembut, toggle status, dan tombol edit/hapus yang mudah dikenali tanpa membuat kartu terasa berat.</w:t>
       </w:r>
     </w:p>
     <w:p>
@@ -1113,6 +1131,15 @@
         <w:spacing w:before="0" w:after="80" w:line="300" w:lineRule="auto"/>
       </w:pPr>
       <w:r>
+        <w:t>Pelanggan wajib memilih outlet aktif; mengganti outlet akan mengosongkan keranjang agar stok tidak tercampur antar cabang.</w:t>
+      </w:r>
+    </w:p>
+    <w:p>
+      <w:pPr>
+        <w:pStyle w:val="ListBullet"/>
+        <w:spacing w:before="0" w:after="80" w:line="300" w:lineRule="auto"/>
+      </w:pPr>
+      <w:r>
         <w:t>Checkout wajib login sebagai pelanggan.</w:t>
       </w:r>
     </w:p>
@@ -1122,7 +1149,43 @@
         <w:spacing w:before="0" w:after="80" w:line="300" w:lineRule="auto"/>
       </w:pPr>
       <w:r>
+        <w:t>Checkout memvalidasi status master produk, kategori, assignment outlet, status konfigurasi outlet, dan ketersediaan produk.</w:t>
+      </w:r>
+    </w:p>
+    <w:p>
+      <w:pPr>
+        <w:pStyle w:val="ListBullet"/>
+        <w:spacing w:before="0" w:after="80" w:line="300" w:lineRule="auto"/>
+      </w:pPr>
+      <w:r>
+        <w:t>Harga checkout memakai harga khusus outlet jika diisi; jika tidak, sistem memakai harga master produk.</w:t>
+      </w:r>
+    </w:p>
+    <w:p>
+      <w:pPr>
+        <w:pStyle w:val="ListBullet"/>
+        <w:spacing w:before="0" w:after="80" w:line="300" w:lineRule="auto"/>
+      </w:pPr>
+      <w:r>
         <w:t>Pesanan tersimpan di database.</w:t>
+      </w:r>
+    </w:p>
+    <w:p>
+      <w:pPr>
+        <w:pStyle w:val="ListBullet"/>
+        <w:spacing w:before="0" w:after="80" w:line="300" w:lineRule="auto"/>
+      </w:pPr>
+      <w:r>
+        <w:t>Pembayaran QRIS, e-wallet, dan transfer bank membuat sesi Midtrans; tanpa API key, aplikasi memakai simulator lokal.</w:t>
+      </w:r>
+    </w:p>
+    <w:p>
+      <w:pPr>
+        <w:pStyle w:val="ListBullet"/>
+        <w:spacing w:before="0" w:after="80" w:line="300" w:lineRule="auto"/>
+      </w:pPr>
+      <w:r>
+        <w:t>Pesanan online hanya dapat diproses setelah berstatus paid. Pembayaran gagal atau kedaluwarsa membatalkan order dan mengembalikan stok.</w:t>
       </w:r>
     </w:p>
     <w:p>
@@ -1197,10 +1260,19 @@
     </w:p>
     <w:p>
       <w:pPr>
+        <w:pStyle w:val="ListBullet"/>
+        <w:spacing w:before="0" w:after="80" w:line="300" w:lineRule="auto"/>
+      </w:pPr>
+      <w:r>
+        <w:t>Cashier terkunci pada outlet penempatannya; Manager/Admin dapat berpindah outlet dari selector dashboard.</w:t>
+      </w:r>
+    </w:p>
+    <w:p>
+      <w:pPr>
         <w:pStyle w:val="Heading2"/>
       </w:pPr>
       <w:r>
-        <w:t>4.6 Inventory</w:t>
+        <w:t>4.6 Multi-outlet</w:t>
       </w:r>
     </w:p>
     <w:p>
@@ -1209,7 +1281,113 @@
         <w:spacing w:before="0" w:after="80" w:line="300" w:lineRule="auto"/>
       </w:pPr>
       <w:r>
-        <w:t>Manager dan Admin dapat CRUD item inventory dengan SKU, satuan, stok, batas minimum, dan harga modal.</w:t>
+        <w:t>Manager dan Admin dapat CRUD outlet, menentukan outlet utama, serta memilih konteks cabang aktif.</w:t>
+      </w:r>
+    </w:p>
+    <w:p>
+      <w:pPr>
+        <w:pStyle w:val="ListBullet"/>
+        <w:spacing w:before="0" w:after="80" w:line="300" w:lineRule="auto"/>
+      </w:pPr>
+      <w:r>
+        <w:t>Outlet menyimpan kode unik, nama, alamat, telepon, status operasional, dan penanda outlet utama.</w:t>
+      </w:r>
+    </w:p>
+    <w:p>
+      <w:pPr>
+        <w:pStyle w:val="ListBullet"/>
+        <w:spacing w:before="0" w:after="80" w:line="300" w:lineRule="auto"/>
+      </w:pPr>
+      <w:r>
+        <w:t>Pesanan, cashier, inventory, mutasi, transaksi keuangan, dan laporan dipisahkan per outlet.</w:t>
+      </w:r>
+    </w:p>
+    <w:p>
+      <w:pPr>
+        <w:pStyle w:val="ListBullet"/>
+        <w:spacing w:before="0" w:after="80" w:line="300" w:lineRule="auto"/>
+      </w:pPr>
+      <w:r>
+        <w:t>Kategori, master produk, add-on, promosi, dan brand digunakan bersama. Manager/Admin mengatur assignment, status aktif/tersedia, serta harga khusus produk pada setiap outlet.</w:t>
+      </w:r>
+    </w:p>
+    <w:p>
+      <w:pPr>
+        <w:pStyle w:val="ListBullet"/>
+        <w:spacing w:before="0" w:after="80" w:line="300" w:lineRule="auto"/>
+      </w:pPr>
+      <w:r>
+        <w:t>Outlet baru menerima assignment awal seluruh produk agar katalog tidak kosong; assignment dapat diubah dari tab Produk.</w:t>
+      </w:r>
+    </w:p>
+    <w:p>
+      <w:pPr>
+        <w:pStyle w:val="ListBullet"/>
+        <w:spacing w:before="0" w:after="80" w:line="300" w:lineRule="auto"/>
+      </w:pPr>
+      <w:r>
+        <w:t>Outlet utama tidak dapat dihapus. Outlet yang sudah memiliki histori akan diarsipkan agar data tetap utuh.</w:t>
+      </w:r>
+    </w:p>
+    <w:p>
+      <w:pPr>
+        <w:pStyle w:val="Heading2"/>
+      </w:pPr>
+      <w:r>
+        <w:t>4.7 Pembayaran Online</w:t>
+      </w:r>
+    </w:p>
+    <w:p>
+      <w:pPr>
+        <w:pStyle w:val="ListBullet"/>
+        <w:spacing w:before="0" w:after="80" w:line="300" w:lineRule="auto"/>
+      </w:pPr>
+      <w:r>
+        <w:t>Integrasi utama memakai Midtrans Snap sandbox/production dari backend.</w:t>
+      </w:r>
+    </w:p>
+    <w:p>
+      <w:pPr>
+        <w:pStyle w:val="ListBullet"/>
+        <w:spacing w:before="0" w:after="80" w:line="300" w:lineRule="auto"/>
+      </w:pPr>
+      <w:r>
+        <w:t>Server Key tidak pernah dikirim ke frontend; webhook memverifikasi signature SHA-512 dan nominal order.</w:t>
+      </w:r>
+    </w:p>
+    <w:p>
+      <w:pPr>
+        <w:pStyle w:val="ListBullet"/>
+        <w:spacing w:before="0" w:after="80" w:line="300" w:lineRule="auto"/>
+      </w:pPr>
+      <w:r>
+        <w:t>Status pembayaran meliputi unpaid, pending, paid, failed, expired, dan refunded.</w:t>
+      </w:r>
+    </w:p>
+    <w:p>
+      <w:pPr>
+        <w:pStyle w:val="ListBullet"/>
+        <w:spacing w:before="0" w:after="80" w:line="300" w:lineRule="auto"/>
+      </w:pPr>
+      <w:r>
+        <w:t>Simulator lokal tersedia di /payment-simulator saat MIDTRANS_SERVER_KEY belum diisi.</w:t>
+      </w:r>
+    </w:p>
+    <w:p>
+      <w:pPr>
+        <w:pStyle w:val="Heading2"/>
+      </w:pPr>
+      <w:r>
+        <w:t>4.8 Inventory</w:t>
+      </w:r>
+    </w:p>
+    <w:p>
+      <w:pPr>
+        <w:pStyle w:val="ListBullet"/>
+        <w:spacing w:before="0" w:after="80" w:line="300" w:lineRule="auto"/>
+      </w:pPr>
+      <w:r>
+        <w:t>Manager dan Admin dapat CRUD item inventory per outlet dengan SKU, satuan, stok, batas minimum, dan harga modal. SKU unik di dalam satu outlet.</w:t>
       </w:r>
     </w:p>
     <w:p>
@@ -1219,6 +1397,15 @@
       </w:pPr>
       <w:r>
         <w:t>Item dapat ditautkan ke produk dan jumlah pemakaian agar checkout mengurangi stok secara otomatis.</w:t>
+      </w:r>
+    </w:p>
+    <w:p>
+      <w:pPr>
+        <w:pStyle w:val="ListBullet"/>
+        <w:spacing w:before="0" w:after="80" w:line="300" w:lineRule="auto"/>
+      </w:pPr>
+      <w:r>
+        <w:t>Pembatalan pesanan (status berubah menjadi cancelled) secara otomatis mengembalikan (refund) stok item terkait ke inventory dan mencatat mutasi masuk (in). Pemulihan pesanan dari batal ke aktif akan memotong stok kembali (gagal jika stok kurang).</w:t>
       </w:r>
     </w:p>
     <w:p>
@@ -1262,7 +1449,7 @@
         <w:pStyle w:val="Heading2"/>
       </w:pPr>
       <w:r>
-        <w:t>4.7 Report Operasional dan Keuangan</w:t>
+        <w:t>4.9 Report Operasional dan Keuangan</w:t>
       </w:r>
     </w:p>
     <w:p>
@@ -1280,7 +1467,7 @@
         <w:spacing w:before="0" w:after="80" w:line="300" w:lineRule="auto"/>
       </w:pPr>
       <w:r>
-        <w:t>Report keuangan mencakup laba rugi, arus kas, neraca sederhana, perubahan modal, dan biaya per kategori.</w:t>
+        <w:t>Report keuangan mencakup laba rugi (menampilkan Pendapatan, HPP/COGS otomatis berdasarkan resep/modal bahan, Laba Kotor, Biaya operasional manual, dan Laba Bersih), arus kas, neraca sederhana, perubahan modal, dan biaya per kategori.</w:t>
       </w:r>
     </w:p>
     <w:p>
@@ -1298,7 +1485,7 @@
         <w:spacing w:before="0" w:after="80" w:line="300" w:lineRule="auto"/>
       </w:pPr>
       <w:r>
-        <w:t>Penjualan non-batal menjadi pendapatan otomatis; utang, piutang, depresiasi, dan pajak belum dihitung.</w:t>
+        <w:t>Penjualan tunai non-batal dan pembayaran online berstatus paid menjadi pendapatan otomatis serta menghitung HPP. Report selalu mengikuti outlet aktif.</w:t>
       </w:r>
     </w:p>
     <w:p>
@@ -1306,7 +1493,25 @@
         <w:pStyle w:val="Heading2"/>
       </w:pPr>
       <w:r>
-        <w:t>4.8 Manager dan Admin</w:t>
+        <w:t>4.10 Manager dan Admin</w:t>
+      </w:r>
+    </w:p>
+    <w:p>
+      <w:pPr>
+        <w:pStyle w:val="ListBullet"/>
+        <w:spacing w:before="0" w:after="80" w:line="300" w:lineRule="auto"/>
+      </w:pPr>
+      <w:r>
+        <w:t>Seluruh modul dashboard Manager/Admin memakai pola visual yang sama: panel terang, sudut membulat, jarak antarelemen yang lega, header dan area tindakan yang konsisten, serta state hover/focus yang jelas.</w:t>
+      </w:r>
+    </w:p>
+    <w:p>
+      <w:pPr>
+        <w:pStyle w:val="ListBullet"/>
+        <w:spacing w:before="0" w:after="80" w:line="300" w:lineRule="auto"/>
+      </w:pPr>
+      <w:r>
+        <w:t>Tampilan tetap nyaman dipakai pada desktop maupun layar ponsel. Navigasi berubah menjadi baris menu bawah dan kartu/tabel menyesuaikan lebar layar tanpa menimbulkan scroll horizontal halaman.</w:t>
       </w:r>
     </w:p>
     <w:p>
@@ -1324,7 +1529,7 @@
         <w:spacing w:before="0" w:after="80" w:line="300" w:lineRule="auto"/>
       </w:pPr>
       <w:r>
-        <w:t>Tab Produk untuk CRUD produk dan pengelolaan add-on.</w:t>
+        <w:t>Tab Produk untuk CRUD master produk, pengelolaan add-on, dan assignment produk pada outlet aktif.</w:t>
       </w:r>
     </w:p>
     <w:p>
@@ -1351,6 +1556,15 @@
         <w:spacing w:before="0" w:after="80" w:line="300" w:lineRule="auto"/>
       </w:pPr>
       <w:r>
+        <w:t>Daftar cashier memakai kartu responsif dengan avatar, nama, email, status akses login, footer terang, serta tombol Edit dan Hapus yang mudah dikenali.</w:t>
+      </w:r>
+    </w:p>
+    <w:p>
+      <w:pPr>
+        <w:pStyle w:val="ListBullet"/>
+        <w:spacing w:before="0" w:after="80" w:line="300" w:lineRule="auto"/>
+      </w:pPr>
+      <w:r>
         <w:t>Tab Inventory untuk item stok, batas minimum, dan stock movement.</w:t>
       </w:r>
     </w:p>
@@ -1361,6 +1575,15 @@
       </w:pPr>
       <w:r>
         <w:t>Tab Report untuk laporan operasional/keuangan, ekspor CSV, serta transaksi biaya/modal.</w:t>
+      </w:r>
+    </w:p>
+    <w:p>
+      <w:pPr>
+        <w:pStyle w:val="ListBullet"/>
+        <w:spacing w:before="0" w:after="80" w:line="300" w:lineRule="auto"/>
+      </w:pPr>
+      <w:r>
+        <w:t>Tab Outlet untuk CRUD cabang dan memilih konteks Cashier, Inventory, serta Report.</w:t>
       </w:r>
     </w:p>
     <w:p>
@@ -1386,7 +1609,7 @@
         <w:pStyle w:val="Heading2"/>
       </w:pPr>
       <w:r>
-        <w:t>4.9 RBAC Modul</w:t>
+        <w:t>4.11 RBAC Modul</w:t>
       </w:r>
     </w:p>
     <w:p>
@@ -1404,7 +1627,7 @@
         <w:spacing w:before="0" w:after="80" w:line="300" w:lineRule="auto"/>
       </w:pPr>
       <w:r>
-        <w:t>RBAC menyimpan matrix akses role cashier, manager, dan admin terhadap modul Stasiun Cashier, Kategori Menu, Produk &amp; Add-on, Promosi, Akun Cashier, Inventory, Report, Franchise, dan RBAC.</w:t>
+        <w:t>RBAC menyimpan matrix akses role cashier, manager, dan admin terhadap modul Stasiun Cashier, Kategori Menu, Produk &amp; Add-on, Promosi, Akun Cashier, Inventory, Report, Outlet, Franchise, dan RBAC.</w:t>
       </w:r>
     </w:p>
     <w:p>
@@ -1445,10 +1668,19 @@
     </w:p>
     <w:p>
       <w:pPr>
+        <w:pStyle w:val="ListBullet"/>
+        <w:spacing w:before="0" w:after="80" w:line="300" w:lineRule="auto"/>
+      </w:pPr>
+      <w:r>
+        <w:t>Tabel akses memakai baris yang lega, penanda aktif/nonaktif yang mudah dibaca, serta panel tindakan terang dan ringkas. Panel tersebut memuat pengingat singkat, tombol Reset tampilan, dan tombol Simpan RBAC tanpa menutupi isi halaman.</w:t>
+      </w:r>
+    </w:p>
+    <w:p>
+      <w:pPr>
         <w:pStyle w:val="Heading2"/>
       </w:pPr>
       <w:r>
-        <w:t>4.10 Hosting Publik Netlify</w:t>
+        <w:t>4.12 Mode Development Lokal</w:t>
       </w:r>
     </w:p>
     <w:p>
@@ -1457,7 +1689,7 @@
         <w:spacing w:before="0" w:after="80" w:line="300" w:lineRule="auto"/>
       </w:pPr>
       <w:r>
-        <w:t>Aplikasi dipublikasikan melalui Netlify dengan domain *.netlify.app tanpa verifikasi pengunjung atau kartu kredit pada paket Free.</w:t>
+        <w:t>Aplikasi dapat berjalan lokal tanpa Netlify.</w:t>
       </w:r>
     </w:p>
     <w:p>
@@ -1466,7 +1698,7 @@
         <w:spacing w:before="0" w:after="80" w:line="300" w:lineRule="auto"/>
       </w:pPr>
       <w:r>
-        <w:t>Frontend Vite dilayani CDN, sedangkan route /api/* dijalankan sebagai Express Netlify Function.</w:t>
+        <w:t>npm run dev menjalankan API Express lokal pada http://localhost:3001 dan frontend Vite pada http://localhost:5175.</w:t>
       </w:r>
     </w:p>
     <w:p>
@@ -1475,7 +1707,7 @@
         <w:spacing w:before="0" w:after="80" w:line="300" w:lineRule="auto"/>
       </w:pPr>
       <w:r>
-        <w:t>Netlify Database menyediakan PostgreSQL persisten untuk akun, produk, pesanan, inventory, laporan, RBAC, dan pengaturan franchise.</w:t>
+        <w:t>Route frontend /api/* diproxy ke API lokal sehingga pengguna tetap membuka satu alamat utama: http://localhost:5175.</w:t>
       </w:r>
     </w:p>
     <w:p>
@@ -1484,7 +1716,7 @@
         <w:spacing w:before="0" w:after="80" w:line="300" w:lineRule="auto"/>
       </w:pPr>
       <w:r>
-        <w:t>Migration database dijalankan otomatis sebelum production deploy dipublikasikan.</w:t>
+        <w:t>Database development memakai PostgreSQL lokal dari DATABASE_URL, POSTGRES_URL, atau LOCAL_DATABASE_URL.</w:t>
       </w:r>
     </w:p>
     <w:p>
@@ -1493,7 +1725,7 @@
         <w:spacing w:before="0" w:after="80" w:line="300" w:lineRule="auto"/>
       </w:pPr>
       <w:r>
-        <w:t>Password Admin, Manager, Cashier, dan JWT secret disimpan sebagai environment variable Netlify dan tidak masuk repository.</w:t>
+        <w:t>Jika tidak ada connection string, backend memakai default postgres://postgres@127.0.0.1:5432/postgres.</w:t>
       </w:r>
     </w:p>
     <w:p>
@@ -1502,7 +1734,51 @@
         <w:spacing w:before="0" w:after="80" w:line="300" w:lineRule="auto"/>
       </w:pPr>
       <w:r>
-        <w:t>Paket Free memakai batas 300 kredit per bulan; project pause jika batas habis dan aktif kembali pada periode berikutnya.</w:t>
+        <w:t>Migration awal tetap memakai file SQL project dan diterapkan otomatis saat database kosong.</w:t>
+      </w:r>
+    </w:p>
+    <w:p>
+      <w:pPr>
+        <w:pStyle w:val="Heading2"/>
+      </w:pPr>
+      <w:r>
+        <w:t>4.13 Hosting Publik Opsional</w:t>
+      </w:r>
+    </w:p>
+    <w:p>
+      <w:pPr>
+        <w:pStyle w:val="ListBullet"/>
+        <w:spacing w:before="0" w:after="80" w:line="300" w:lineRule="auto"/>
+      </w:pPr>
+      <w:r>
+        <w:t>Project masih dapat dibuild untuk hosting publik melalui Netlify Function atau host Node lain.</w:t>
+      </w:r>
+    </w:p>
+    <w:p>
+      <w:pPr>
+        <w:pStyle w:val="ListBullet"/>
+        <w:spacing w:before="0" w:after="80" w:line="300" w:lineRule="auto"/>
+      </w:pPr>
+      <w:r>
+        <w:t>Database lokal di komputer tidak dapat dipakai oleh website publik ketika komputer mati/offline atau tidak dapat diakses dari internet.</w:t>
+      </w:r>
+    </w:p>
+    <w:p>
+      <w:pPr>
+        <w:pStyle w:val="ListBullet"/>
+        <w:spacing w:before="0" w:after="80" w:line="300" w:lineRule="auto"/>
+      </w:pPr>
+      <w:r>
+        <w:t>Untuk website publik yang aktif 24 jam, hosting perlu memakai PostgreSQL online yang diisi melalui DATABASE_URL atau POSTGRES_URL.</w:t>
+      </w:r>
+    </w:p>
+    <w:p>
+      <w:pPr>
+        <w:pStyle w:val="ListBullet"/>
+        <w:spacing w:before="0" w:after="80" w:line="300" w:lineRule="auto"/>
+      </w:pPr>
+      <w:r>
+        <w:t>Password Admin, Manager, Cashier, dan JWT secret harus disimpan sebagai environment variable hosting dan tidak masuk repository.</w:t>
       </w:r>
     </w:p>
     <w:p>
@@ -1659,6 +1935,688 @@
                 <w:sz w:val="19"/>
               </w:rPr>
               <w:t>Perubahan</w:t>
+            </w:r>
+          </w:p>
+        </w:tc>
+      </w:tr>
+      <w:tr>
+        <w:tc>
+          <w:tcPr>
+            <w:tcW w:type="dxa" w:w="1944"/>
+            <w:tcMar>
+              <w:top w:w="80" w:type="dxa"/>
+              <w:start w:w="120" w:type="dxa"/>
+              <w:bottom w:w="80" w:type="dxa"/>
+              <w:end w:w="120" w:type="dxa"/>
+            </w:tcMar>
+            <w:tcBorders>
+              <w:top w:val="single" w:sz="6" w:space="0" w:color="D9E2EC"/>
+              <w:left w:val="single" w:sz="6" w:space="0" w:color="D9E2EC"/>
+              <w:bottom w:val="single" w:sz="6" w:space="0" w:color="D9E2EC"/>
+              <w:right w:val="single" w:sz="6" w:space="0" w:color="D9E2EC"/>
+            </w:tcBorders>
+          </w:tcPr>
+          <w:p>
+            <w:pPr>
+              <w:spacing w:before="0" w:after="0" w:line="276" w:lineRule="auto"/>
+            </w:pPr>
+            <w:r>
+              <w:rPr>
+                <w:rFonts w:ascii="Calibri" w:hAnsi="Calibri" w:eastAsia="Calibri"/>
+                <w:color w:val="1F2937"/>
+                <w:sz w:val="19"/>
+              </w:rPr>
+              <w:t>2026-07-12</w:t>
+            </w:r>
+          </w:p>
+        </w:tc>
+        <w:tc>
+          <w:tcPr>
+            <w:tcW w:type="dxa" w:w="7416"/>
+            <w:tcMar>
+              <w:top w:w="80" w:type="dxa"/>
+              <w:start w:w="120" w:type="dxa"/>
+              <w:bottom w:w="80" w:type="dxa"/>
+              <w:end w:w="120" w:type="dxa"/>
+            </w:tcMar>
+            <w:tcBorders>
+              <w:top w:val="single" w:sz="6" w:space="0" w:color="D9E2EC"/>
+              <w:left w:val="single" w:sz="6" w:space="0" w:color="D9E2EC"/>
+              <w:bottom w:val="single" w:sz="6" w:space="0" w:color="D9E2EC"/>
+              <w:right w:val="single" w:sz="6" w:space="0" w:color="D9E2EC"/>
+            </w:tcBorders>
+          </w:tcPr>
+          <w:p>
+            <w:pPr>
+              <w:spacing w:before="0" w:after="0" w:line="276" w:lineRule="auto"/>
+            </w:pPr>
+            <w:r>
+              <w:rPr>
+                <w:rFonts w:ascii="Calibri" w:hAnsi="Calibri" w:eastAsia="Calibri"/>
+                <w:color w:val="1F2937"/>
+                <w:sz w:val="19"/>
+              </w:rPr>
+              <w:t>Menambahkan assignment produk per outlet, harga khusus, status aktif/tersedia per cabang, filter katalog outlet, dan validasi checkout berbasis outlet_products, sementara kategori dan master produk tetap global.</w:t>
+            </w:r>
+          </w:p>
+        </w:tc>
+      </w:tr>
+      <w:tr>
+        <w:tc>
+          <w:tcPr>
+            <w:tcW w:type="dxa" w:w="1944"/>
+            <w:tcMar>
+              <w:top w:w="80" w:type="dxa"/>
+              <w:start w:w="120" w:type="dxa"/>
+              <w:bottom w:w="80" w:type="dxa"/>
+              <w:end w:w="120" w:type="dxa"/>
+            </w:tcMar>
+            <w:tcBorders>
+              <w:top w:val="single" w:sz="6" w:space="0" w:color="D9E2EC"/>
+              <w:left w:val="single" w:sz="6" w:space="0" w:color="D9E2EC"/>
+              <w:bottom w:val="single" w:sz="6" w:space="0" w:color="D9E2EC"/>
+              <w:right w:val="single" w:sz="6" w:space="0" w:color="D9E2EC"/>
+            </w:tcBorders>
+          </w:tcPr>
+          <w:p>
+            <w:pPr>
+              <w:spacing w:before="0" w:after="0" w:line="276" w:lineRule="auto"/>
+            </w:pPr>
+            <w:r>
+              <w:rPr>
+                <w:rFonts w:ascii="Calibri" w:hAnsi="Calibri" w:eastAsia="Calibri"/>
+                <w:color w:val="1F2937"/>
+                <w:sz w:val="19"/>
+              </w:rPr>
+              <w:t>2026-07-12</w:t>
+            </w:r>
+          </w:p>
+        </w:tc>
+        <w:tc>
+          <w:tcPr>
+            <w:tcW w:type="dxa" w:w="7416"/>
+            <w:tcMar>
+              <w:top w:w="80" w:type="dxa"/>
+              <w:start w:w="120" w:type="dxa"/>
+              <w:bottom w:w="80" w:type="dxa"/>
+              <w:end w:w="120" w:type="dxa"/>
+            </w:tcMar>
+            <w:tcBorders>
+              <w:top w:val="single" w:sz="6" w:space="0" w:color="D9E2EC"/>
+              <w:left w:val="single" w:sz="6" w:space="0" w:color="D9E2EC"/>
+              <w:bottom w:val="single" w:sz="6" w:space="0" w:color="D9E2EC"/>
+              <w:right w:val="single" w:sz="6" w:space="0" w:color="D9E2EC"/>
+            </w:tcBorders>
+          </w:tcPr>
+          <w:p>
+            <w:pPr>
+              <w:spacing w:before="0" w:after="0" w:line="276" w:lineRule="auto"/>
+            </w:pPr>
+            <w:r>
+              <w:rPr>
+                <w:rFonts w:ascii="Calibri" w:hAnsi="Calibri" w:eastAsia="Calibri"/>
+                <w:color w:val="1F2937"/>
+                <w:sz w:val="19"/>
+              </w:rPr>
+              <w:t>Menyeragamkan tampilan seluruh modul Manager/Admin—Produk, Kategori, Promosi, Cashier, Inventory, Report, Outlet, Franchise, dan RBAC—dengan panel terang, area tindakan konsisten, serta layout responsif.</w:t>
+            </w:r>
+          </w:p>
+        </w:tc>
+      </w:tr>
+      <w:tr>
+        <w:tc>
+          <w:tcPr>
+            <w:tcW w:type="dxa" w:w="1944"/>
+            <w:tcMar>
+              <w:top w:w="80" w:type="dxa"/>
+              <w:start w:w="120" w:type="dxa"/>
+              <w:bottom w:w="80" w:type="dxa"/>
+              <w:end w:w="120" w:type="dxa"/>
+            </w:tcMar>
+            <w:tcBorders>
+              <w:top w:val="single" w:sz="6" w:space="0" w:color="D9E2EC"/>
+              <w:left w:val="single" w:sz="6" w:space="0" w:color="D9E2EC"/>
+              <w:bottom w:val="single" w:sz="6" w:space="0" w:color="D9E2EC"/>
+              <w:right w:val="single" w:sz="6" w:space="0" w:color="D9E2EC"/>
+            </w:tcBorders>
+          </w:tcPr>
+          <w:p>
+            <w:pPr>
+              <w:spacing w:before="0" w:after="0" w:line="276" w:lineRule="auto"/>
+            </w:pPr>
+            <w:r>
+              <w:rPr>
+                <w:rFonts w:ascii="Calibri" w:hAnsi="Calibri" w:eastAsia="Calibri"/>
+                <w:color w:val="1F2937"/>
+                <w:sz w:val="19"/>
+              </w:rPr>
+              <w:t>2026-07-12</w:t>
+            </w:r>
+          </w:p>
+        </w:tc>
+        <w:tc>
+          <w:tcPr>
+            <w:tcW w:type="dxa" w:w="7416"/>
+            <w:tcMar>
+              <w:top w:w="80" w:type="dxa"/>
+              <w:start w:w="120" w:type="dxa"/>
+              <w:bottom w:w="80" w:type="dxa"/>
+              <w:end w:w="120" w:type="dxa"/>
+            </w:tcMar>
+            <w:tcBorders>
+              <w:top w:val="single" w:sz="6" w:space="0" w:color="D9E2EC"/>
+              <w:left w:val="single" w:sz="6" w:space="0" w:color="D9E2EC"/>
+              <w:bottom w:val="single" w:sz="6" w:space="0" w:color="D9E2EC"/>
+              <w:right w:val="single" w:sz="6" w:space="0" w:color="D9E2EC"/>
+            </w:tcBorders>
+          </w:tcPr>
+          <w:p>
+            <w:pPr>
+              <w:spacing w:before="0" w:after="0" w:line="276" w:lineRule="auto"/>
+            </w:pPr>
+            <w:r>
+              <w:rPr>
+                <w:rFonts w:ascii="Calibri" w:hAnsi="Calibri" w:eastAsia="Calibri"/>
+                <w:color w:val="1F2937"/>
+                <w:sz w:val="19"/>
+              </w:rPr>
+              <w:t>Menambahkan multi-outlet untuk pesanan, cashier, inventory, transaksi keuangan, dan laporan; melengkapi dashboard dengan pemilih outlet serta modul CRUD cabang.</w:t>
+            </w:r>
+          </w:p>
+        </w:tc>
+      </w:tr>
+      <w:tr>
+        <w:tc>
+          <w:tcPr>
+            <w:tcW w:type="dxa" w:w="1944"/>
+            <w:tcMar>
+              <w:top w:w="80" w:type="dxa"/>
+              <w:start w:w="120" w:type="dxa"/>
+              <w:bottom w:w="80" w:type="dxa"/>
+              <w:end w:w="120" w:type="dxa"/>
+            </w:tcMar>
+            <w:tcBorders>
+              <w:top w:val="single" w:sz="6" w:space="0" w:color="D9E2EC"/>
+              <w:left w:val="single" w:sz="6" w:space="0" w:color="D9E2EC"/>
+              <w:bottom w:val="single" w:sz="6" w:space="0" w:color="D9E2EC"/>
+              <w:right w:val="single" w:sz="6" w:space="0" w:color="D9E2EC"/>
+            </w:tcBorders>
+          </w:tcPr>
+          <w:p>
+            <w:pPr>
+              <w:spacing w:before="0" w:after="0" w:line="276" w:lineRule="auto"/>
+            </w:pPr>
+            <w:r>
+              <w:rPr>
+                <w:rFonts w:ascii="Calibri" w:hAnsi="Calibri" w:eastAsia="Calibri"/>
+                <w:color w:val="1F2937"/>
+                <w:sz w:val="19"/>
+              </w:rPr>
+              <w:t>2026-07-12</w:t>
+            </w:r>
+          </w:p>
+        </w:tc>
+        <w:tc>
+          <w:tcPr>
+            <w:tcW w:type="dxa" w:w="7416"/>
+            <w:tcMar>
+              <w:top w:w="80" w:type="dxa"/>
+              <w:start w:w="120" w:type="dxa"/>
+              <w:bottom w:w="80" w:type="dxa"/>
+              <w:end w:w="120" w:type="dxa"/>
+            </w:tcMar>
+            <w:tcBorders>
+              <w:top w:val="single" w:sz="6" w:space="0" w:color="D9E2EC"/>
+              <w:left w:val="single" w:sz="6" w:space="0" w:color="D9E2EC"/>
+              <w:bottom w:val="single" w:sz="6" w:space="0" w:color="D9E2EC"/>
+              <w:right w:val="single" w:sz="6" w:space="0" w:color="D9E2EC"/>
+            </w:tcBorders>
+          </w:tcPr>
+          <w:p>
+            <w:pPr>
+              <w:spacing w:before="0" w:after="0" w:line="276" w:lineRule="auto"/>
+            </w:pPr>
+            <w:r>
+              <w:rPr>
+                <w:rFonts w:ascii="Calibri" w:hAnsi="Calibri" w:eastAsia="Calibri"/>
+                <w:color w:val="1F2937"/>
+                <w:sz w:val="19"/>
+              </w:rPr>
+              <w:t>Menambahkan pembayaran online Midtrans Snap, verifikasi webhook, status pembayaran, perlindungan proses pesanan sebelum lunas, dan simulator lokal tanpa API key.</w:t>
+            </w:r>
+          </w:p>
+        </w:tc>
+      </w:tr>
+      <w:tr>
+        <w:tc>
+          <w:tcPr>
+            <w:tcW w:type="dxa" w:w="1944"/>
+            <w:tcMar>
+              <w:top w:w="80" w:type="dxa"/>
+              <w:start w:w="120" w:type="dxa"/>
+              <w:bottom w:w="80" w:type="dxa"/>
+              <w:end w:w="120" w:type="dxa"/>
+            </w:tcMar>
+            <w:tcBorders>
+              <w:top w:val="single" w:sz="6" w:space="0" w:color="D9E2EC"/>
+              <w:left w:val="single" w:sz="6" w:space="0" w:color="D9E2EC"/>
+              <w:bottom w:val="single" w:sz="6" w:space="0" w:color="D9E2EC"/>
+              <w:right w:val="single" w:sz="6" w:space="0" w:color="D9E2EC"/>
+            </w:tcBorders>
+          </w:tcPr>
+          <w:p>
+            <w:pPr>
+              <w:spacing w:before="0" w:after="0" w:line="276" w:lineRule="auto"/>
+            </w:pPr>
+            <w:r>
+              <w:rPr>
+                <w:rFonts w:ascii="Calibri" w:hAnsi="Calibri" w:eastAsia="Calibri"/>
+                <w:color w:val="1F2937"/>
+                <w:sz w:val="19"/>
+              </w:rPr>
+              <w:t>2026-07-12</w:t>
+            </w:r>
+          </w:p>
+        </w:tc>
+        <w:tc>
+          <w:tcPr>
+            <w:tcW w:type="dxa" w:w="7416"/>
+            <w:tcMar>
+              <w:top w:w="80" w:type="dxa"/>
+              <w:start w:w="120" w:type="dxa"/>
+              <w:bottom w:w="80" w:type="dxa"/>
+              <w:end w:w="120" w:type="dxa"/>
+            </w:tcMar>
+            <w:tcBorders>
+              <w:top w:val="single" w:sz="6" w:space="0" w:color="D9E2EC"/>
+              <w:left w:val="single" w:sz="6" w:space="0" w:color="D9E2EC"/>
+              <w:bottom w:val="single" w:sz="6" w:space="0" w:color="D9E2EC"/>
+              <w:right w:val="single" w:sz="6" w:space="0" w:color="D9E2EC"/>
+            </w:tcBorders>
+          </w:tcPr>
+          <w:p>
+            <w:pPr>
+              <w:spacing w:before="0" w:after="0" w:line="276" w:lineRule="auto"/>
+            </w:pPr>
+            <w:r>
+              <w:rPr>
+                <w:rFonts w:ascii="Calibri" w:hAnsi="Calibri" w:eastAsia="Calibri"/>
+                <w:color w:val="1F2937"/>
+                <w:sz w:val="19"/>
+              </w:rPr>
+              <w:t>Menyegarkan tampilan RBAC dengan tabel yang lebih nyaman dibaca, switch yang lebih jelas, dan panel simpan terang yang ringkas serta responsif.</w:t>
+            </w:r>
+          </w:p>
+        </w:tc>
+      </w:tr>
+      <w:tr>
+        <w:tc>
+          <w:tcPr>
+            <w:tcW w:type="dxa" w:w="1944"/>
+            <w:tcMar>
+              <w:top w:w="80" w:type="dxa"/>
+              <w:start w:w="120" w:type="dxa"/>
+              <w:bottom w:w="80" w:type="dxa"/>
+              <w:end w:w="120" w:type="dxa"/>
+            </w:tcMar>
+            <w:tcBorders>
+              <w:top w:val="single" w:sz="6" w:space="0" w:color="D9E2EC"/>
+              <w:left w:val="single" w:sz="6" w:space="0" w:color="D9E2EC"/>
+              <w:bottom w:val="single" w:sz="6" w:space="0" w:color="D9E2EC"/>
+              <w:right w:val="single" w:sz="6" w:space="0" w:color="D9E2EC"/>
+            </w:tcBorders>
+          </w:tcPr>
+          <w:p>
+            <w:pPr>
+              <w:spacing w:before="0" w:after="0" w:line="276" w:lineRule="auto"/>
+            </w:pPr>
+            <w:r>
+              <w:rPr>
+                <w:rFonts w:ascii="Calibri" w:hAnsi="Calibri" w:eastAsia="Calibri"/>
+                <w:color w:val="1F2937"/>
+                <w:sz w:val="19"/>
+              </w:rPr>
+              <w:t>2026-07-12</w:t>
+            </w:r>
+          </w:p>
+        </w:tc>
+        <w:tc>
+          <w:tcPr>
+            <w:tcW w:type="dxa" w:w="7416"/>
+            <w:tcMar>
+              <w:top w:w="80" w:type="dxa"/>
+              <w:start w:w="120" w:type="dxa"/>
+              <w:bottom w:w="80" w:type="dxa"/>
+              <w:end w:w="120" w:type="dxa"/>
+            </w:tcMar>
+            <w:tcBorders>
+              <w:top w:val="single" w:sz="6" w:space="0" w:color="D9E2EC"/>
+              <w:left w:val="single" w:sz="6" w:space="0" w:color="D9E2EC"/>
+              <w:bottom w:val="single" w:sz="6" w:space="0" w:color="D9E2EC"/>
+              <w:right w:val="single" w:sz="6" w:space="0" w:color="D9E2EC"/>
+            </w:tcBorders>
+          </w:tcPr>
+          <w:p>
+            <w:pPr>
+              <w:spacing w:before="0" w:after="0" w:line="276" w:lineRule="auto"/>
+            </w:pPr>
+            <w:r>
+              <w:rPr>
+                <w:rFonts w:ascii="Calibri" w:hAnsi="Calibri" w:eastAsia="Calibri"/>
+                <w:color w:val="1F2937"/>
+                <w:sz w:val="19"/>
+              </w:rPr>
+              <w:t>Menyelaraskan tampilan kartu cashier dengan kartu kategori: avatar lembut, status akses informatif, footer terang, tombol aksi berlabel, serta efek hover.</w:t>
+            </w:r>
+          </w:p>
+        </w:tc>
+      </w:tr>
+      <w:tr>
+        <w:tc>
+          <w:tcPr>
+            <w:tcW w:type="dxa" w:w="1944"/>
+            <w:tcMar>
+              <w:top w:w="80" w:type="dxa"/>
+              <w:start w:w="120" w:type="dxa"/>
+              <w:bottom w:w="80" w:type="dxa"/>
+              <w:end w:w="120" w:type="dxa"/>
+            </w:tcMar>
+            <w:tcBorders>
+              <w:top w:val="single" w:sz="6" w:space="0" w:color="D9E2EC"/>
+              <w:left w:val="single" w:sz="6" w:space="0" w:color="D9E2EC"/>
+              <w:bottom w:val="single" w:sz="6" w:space="0" w:color="D9E2EC"/>
+              <w:right w:val="single" w:sz="6" w:space="0" w:color="D9E2EC"/>
+            </w:tcBorders>
+          </w:tcPr>
+          <w:p>
+            <w:pPr>
+              <w:spacing w:before="0" w:after="0" w:line="276" w:lineRule="auto"/>
+            </w:pPr>
+            <w:r>
+              <w:rPr>
+                <w:rFonts w:ascii="Calibri" w:hAnsi="Calibri" w:eastAsia="Calibri"/>
+                <w:color w:val="1F2937"/>
+                <w:sz w:val="19"/>
+              </w:rPr>
+              <w:t>2026-07-12</w:t>
+            </w:r>
+          </w:p>
+        </w:tc>
+        <w:tc>
+          <w:tcPr>
+            <w:tcW w:type="dxa" w:w="7416"/>
+            <w:tcMar>
+              <w:top w:w="80" w:type="dxa"/>
+              <w:start w:w="120" w:type="dxa"/>
+              <w:bottom w:w="80" w:type="dxa"/>
+              <w:end w:w="120" w:type="dxa"/>
+            </w:tcMar>
+            <w:tcBorders>
+              <w:top w:val="single" w:sz="6" w:space="0" w:color="D9E2EC"/>
+              <w:left w:val="single" w:sz="6" w:space="0" w:color="D9E2EC"/>
+              <w:bottom w:val="single" w:sz="6" w:space="0" w:color="D9E2EC"/>
+              <w:right w:val="single" w:sz="6" w:space="0" w:color="D9E2EC"/>
+            </w:tcBorders>
+          </w:tcPr>
+          <w:p>
+            <w:pPr>
+              <w:spacing w:before="0" w:after="0" w:line="276" w:lineRule="auto"/>
+            </w:pPr>
+            <w:r>
+              <w:rPr>
+                <w:rFonts w:ascii="Calibri" w:hAnsi="Calibri" w:eastAsia="Calibri"/>
+                <w:color w:val="1F2937"/>
+                <w:sz w:val="19"/>
+              </w:rPr>
+              <w:t>Menyegarkan tampilan kartu kategori dengan layout yang lebih ringan, status visibilitas informatif, footer lembut, tombol aksi interaktif, dan efek hover.</w:t>
+            </w:r>
+          </w:p>
+        </w:tc>
+      </w:tr>
+      <w:tr>
+        <w:tc>
+          <w:tcPr>
+            <w:tcW w:type="dxa" w:w="1944"/>
+            <w:tcMar>
+              <w:top w:w="80" w:type="dxa"/>
+              <w:start w:w="120" w:type="dxa"/>
+              <w:bottom w:w="80" w:type="dxa"/>
+              <w:end w:w="120" w:type="dxa"/>
+            </w:tcMar>
+            <w:tcBorders>
+              <w:top w:val="single" w:sz="6" w:space="0" w:color="D9E2EC"/>
+              <w:left w:val="single" w:sz="6" w:space="0" w:color="D9E2EC"/>
+              <w:bottom w:val="single" w:sz="6" w:space="0" w:color="D9E2EC"/>
+              <w:right w:val="single" w:sz="6" w:space="0" w:color="D9E2EC"/>
+            </w:tcBorders>
+          </w:tcPr>
+          <w:p>
+            <w:pPr>
+              <w:spacing w:before="0" w:after="0" w:line="276" w:lineRule="auto"/>
+            </w:pPr>
+            <w:r>
+              <w:rPr>
+                <w:rFonts w:ascii="Calibri" w:hAnsi="Calibri" w:eastAsia="Calibri"/>
+                <w:color w:val="1F2937"/>
+                <w:sz w:val="19"/>
+              </w:rPr>
+              <w:t>2026-07-12</w:t>
+            </w:r>
+          </w:p>
+        </w:tc>
+        <w:tc>
+          <w:tcPr>
+            <w:tcW w:type="dxa" w:w="7416"/>
+            <w:tcMar>
+              <w:top w:w="80" w:type="dxa"/>
+              <w:start w:w="120" w:type="dxa"/>
+              <w:bottom w:w="80" w:type="dxa"/>
+              <w:end w:w="120" w:type="dxa"/>
+            </w:tcMar>
+            <w:tcBorders>
+              <w:top w:val="single" w:sz="6" w:space="0" w:color="D9E2EC"/>
+              <w:left w:val="single" w:sz="6" w:space="0" w:color="D9E2EC"/>
+              <w:bottom w:val="single" w:sz="6" w:space="0" w:color="D9E2EC"/>
+              <w:right w:val="single" w:sz="6" w:space="0" w:color="D9E2EC"/>
+            </w:tcBorders>
+          </w:tcPr>
+          <w:p>
+            <w:pPr>
+              <w:spacing w:before="0" w:after="0" w:line="276" w:lineRule="auto"/>
+            </w:pPr>
+            <w:r>
+              <w:rPr>
+                <w:rFonts w:ascii="Calibri" w:hAnsi="Calibri" w:eastAsia="Calibri"/>
+                <w:color w:val="1F2937"/>
+                <w:sz w:val="19"/>
+              </w:rPr>
+              <w:t>Merapikan gaya bahasa FSD agar lebih natural dan mudah dibaca tanpa mengubah makna fungsional maupun istilah teknis.</w:t>
+            </w:r>
+          </w:p>
+        </w:tc>
+      </w:tr>
+      <w:tr>
+        <w:tc>
+          <w:tcPr>
+            <w:tcW w:type="dxa" w:w="1944"/>
+            <w:tcMar>
+              <w:top w:w="80" w:type="dxa"/>
+              <w:start w:w="120" w:type="dxa"/>
+              <w:bottom w:w="80" w:type="dxa"/>
+              <w:end w:w="120" w:type="dxa"/>
+            </w:tcMar>
+            <w:tcBorders>
+              <w:top w:val="single" w:sz="6" w:space="0" w:color="D9E2EC"/>
+              <w:left w:val="single" w:sz="6" w:space="0" w:color="D9E2EC"/>
+              <w:bottom w:val="single" w:sz="6" w:space="0" w:color="D9E2EC"/>
+              <w:right w:val="single" w:sz="6" w:space="0" w:color="D9E2EC"/>
+            </w:tcBorders>
+          </w:tcPr>
+          <w:p>
+            <w:pPr>
+              <w:spacing w:before="0" w:after="0" w:line="276" w:lineRule="auto"/>
+            </w:pPr>
+            <w:r>
+              <w:rPr>
+                <w:rFonts w:ascii="Calibri" w:hAnsi="Calibri" w:eastAsia="Calibri"/>
+                <w:color w:val="1F2937"/>
+                <w:sz w:val="19"/>
+              </w:rPr>
+              <w:t>2026-07-12</w:t>
+            </w:r>
+          </w:p>
+        </w:tc>
+        <w:tc>
+          <w:tcPr>
+            <w:tcW w:type="dxa" w:w="7416"/>
+            <w:tcMar>
+              <w:top w:w="80" w:type="dxa"/>
+              <w:start w:w="120" w:type="dxa"/>
+              <w:bottom w:w="80" w:type="dxa"/>
+              <w:end w:w="120" w:type="dxa"/>
+            </w:tcMar>
+            <w:tcBorders>
+              <w:top w:val="single" w:sz="6" w:space="0" w:color="D9E2EC"/>
+              <w:left w:val="single" w:sz="6" w:space="0" w:color="D9E2EC"/>
+              <w:bottom w:val="single" w:sz="6" w:space="0" w:color="D9E2EC"/>
+              <w:right w:val="single" w:sz="6" w:space="0" w:color="D9E2EC"/>
+            </w:tcBorders>
+          </w:tcPr>
+          <w:p>
+            <w:pPr>
+              <w:spacing w:before="0" w:after="0" w:line="276" w:lineRule="auto"/>
+            </w:pPr>
+            <w:r>
+              <w:rPr>
+                <w:rFonts w:ascii="Calibri" w:hAnsi="Calibri" w:eastAsia="Calibri"/>
+                <w:color w:val="1F2937"/>
+                <w:sz w:val="19"/>
+              </w:rPr>
+              <w:t>Memisahkan URL dashboard berdasarkan role: Admin memakai /admin, Manager memakai /manager, serta menambahkan pengalihan otomatis ke URL kanonis role.</w:t>
+            </w:r>
+          </w:p>
+        </w:tc>
+      </w:tr>
+      <w:tr>
+        <w:tc>
+          <w:tcPr>
+            <w:tcW w:type="dxa" w:w="1944"/>
+            <w:tcMar>
+              <w:top w:w="80" w:type="dxa"/>
+              <w:start w:w="120" w:type="dxa"/>
+              <w:bottom w:w="80" w:type="dxa"/>
+              <w:end w:w="120" w:type="dxa"/>
+            </w:tcMar>
+            <w:tcBorders>
+              <w:top w:val="single" w:sz="6" w:space="0" w:color="D9E2EC"/>
+              <w:left w:val="single" w:sz="6" w:space="0" w:color="D9E2EC"/>
+              <w:bottom w:val="single" w:sz="6" w:space="0" w:color="D9E2EC"/>
+              <w:right w:val="single" w:sz="6" w:space="0" w:color="D9E2EC"/>
+            </w:tcBorders>
+          </w:tcPr>
+          <w:p>
+            <w:pPr>
+              <w:spacing w:before="0" w:after="0" w:line="276" w:lineRule="auto"/>
+            </w:pPr>
+            <w:r>
+              <w:rPr>
+                <w:rFonts w:ascii="Calibri" w:hAnsi="Calibri" w:eastAsia="Calibri"/>
+                <w:color w:val="1F2937"/>
+                <w:sz w:val="19"/>
+              </w:rPr>
+              <w:t>2026-07-10</w:t>
+            </w:r>
+          </w:p>
+        </w:tc>
+        <w:tc>
+          <w:tcPr>
+            <w:tcW w:type="dxa" w:w="7416"/>
+            <w:tcMar>
+              <w:top w:w="80" w:type="dxa"/>
+              <w:start w:w="120" w:type="dxa"/>
+              <w:bottom w:w="80" w:type="dxa"/>
+              <w:end w:w="120" w:type="dxa"/>
+            </w:tcMar>
+            <w:tcBorders>
+              <w:top w:val="single" w:sz="6" w:space="0" w:color="D9E2EC"/>
+              <w:left w:val="single" w:sz="6" w:space="0" w:color="D9E2EC"/>
+              <w:bottom w:val="single" w:sz="6" w:space="0" w:color="D9E2EC"/>
+              <w:right w:val="single" w:sz="6" w:space="0" w:color="D9E2EC"/>
+            </w:tcBorders>
+          </w:tcPr>
+          <w:p>
+            <w:pPr>
+              <w:spacing w:before="0" w:after="0" w:line="276" w:lineRule="auto"/>
+            </w:pPr>
+            <w:r>
+              <w:rPr>
+                <w:rFonts w:ascii="Calibri" w:hAnsi="Calibri" w:eastAsia="Calibri"/>
+                <w:color w:val="1F2937"/>
+                <w:sz w:val="19"/>
+              </w:rPr>
+              <w:t>Mengubah mode development agar database berjalan lokal tanpa Netlify: API lokal port 3001, Vite port 5175 dengan proxy /api, PostgreSQL lokal melalui DATABASE_URL, dan dokumentasi lokal diperbarui.</w:t>
+            </w:r>
+          </w:p>
+        </w:tc>
+      </w:tr>
+      <w:tr>
+        <w:tc>
+          <w:tcPr>
+            <w:tcW w:type="dxa" w:w="1944"/>
+            <w:tcMar>
+              <w:top w:w="80" w:type="dxa"/>
+              <w:start w:w="120" w:type="dxa"/>
+              <w:bottom w:w="80" w:type="dxa"/>
+              <w:end w:w="120" w:type="dxa"/>
+            </w:tcMar>
+            <w:tcBorders>
+              <w:top w:val="single" w:sz="6" w:space="0" w:color="D9E2EC"/>
+              <w:left w:val="single" w:sz="6" w:space="0" w:color="D9E2EC"/>
+              <w:bottom w:val="single" w:sz="6" w:space="0" w:color="D9E2EC"/>
+              <w:right w:val="single" w:sz="6" w:space="0" w:color="D9E2EC"/>
+            </w:tcBorders>
+          </w:tcPr>
+          <w:p>
+            <w:pPr>
+              <w:spacing w:before="0" w:after="0" w:line="276" w:lineRule="auto"/>
+            </w:pPr>
+            <w:r>
+              <w:rPr>
+                <w:rFonts w:ascii="Calibri" w:hAnsi="Calibri" w:eastAsia="Calibri"/>
+                <w:color w:val="1F2937"/>
+                <w:sz w:val="19"/>
+              </w:rPr>
+              <w:t>2026-07-06</w:t>
+            </w:r>
+          </w:p>
+        </w:tc>
+        <w:tc>
+          <w:tcPr>
+            <w:tcW w:type="dxa" w:w="7416"/>
+            <w:tcMar>
+              <w:top w:w="80" w:type="dxa"/>
+              <w:start w:w="120" w:type="dxa"/>
+              <w:bottom w:w="80" w:type="dxa"/>
+              <w:end w:w="120" w:type="dxa"/>
+            </w:tcMar>
+            <w:tcBorders>
+              <w:top w:val="single" w:sz="6" w:space="0" w:color="D9E2EC"/>
+              <w:left w:val="single" w:sz="6" w:space="0" w:color="D9E2EC"/>
+              <w:bottom w:val="single" w:sz="6" w:space="0" w:color="D9E2EC"/>
+              <w:right w:val="single" w:sz="6" w:space="0" w:color="D9E2EC"/>
+            </w:tcBorders>
+          </w:tcPr>
+          <w:p>
+            <w:pPr>
+              <w:spacing w:before="0" w:after="0" w:line="276" w:lineRule="auto"/>
+            </w:pPr>
+            <w:r>
+              <w:rPr>
+                <w:rFonts w:ascii="Calibri" w:hAnsi="Calibri" w:eastAsia="Calibri"/>
+                <w:color w:val="1F2937"/>
+                <w:sz w:val="19"/>
+              </w:rPr>
+              <w:t>Deploy production Netlify aktif pada https://tokokopdes.netlify.app, Netlify Database diprovision, migration production diterapkan, dan backend dibuat kompatibel dengan deploy manual CLI melalui NETLIFY_DB_URL.</w:t>
             </w:r>
           </w:p>
         </w:tc>
@@ -2495,7 +3453,7 @@
         <w:color w:val="667085"/>
         <w:sz w:val="17"/>
       </w:rPr>
-      <w:t>Franchise Ordering Platform · FSD · Update 2026-07-06</w:t>
+      <w:t>Franchise Ordering Platform · FSD · Update 2026-07-12</w:t>
     </w:r>
   </w:p>
 </w:ftr>

</xml_diff>

<commit_message>
perf: optimize database queries, middleware auth cache, serverless cold-starts, and online payment session expiration
</commit_message>
<xml_diff>
--- a/docs/FSD.docx
+++ b/docs/FSD.docx
@@ -1176,7 +1176,7 @@
         <w:spacing w:before="0" w:after="80" w:line="300" w:lineRule="auto"/>
       </w:pPr>
       <w:r>
-        <w:t>Pembayaran QRIS, e-wallet, dan transfer bank membuat sesi Midtrans; tanpa API key, aplikasi memakai simulator lokal.</w:t>
+        <w:t>Pembayaran QRIS, e-wallet, dan transfer bank membuat sesi Midtrans; tanpa API key, aplikasi memakai simulator lokal. Sesi pembayaran online Midtrans diatur kedaluwarsa otomatis dalam 15 menit melalui parameter Snap expiry untuk mencegah penguncian stok jangka panjang.</w:t>
       </w:r>
     </w:p>
     <w:p>
@@ -1935,6 +1935,68 @@
                 <w:sz w:val="19"/>
               </w:rPr>
               <w:t>Perubahan</w:t>
+            </w:r>
+          </w:p>
+        </w:tc>
+      </w:tr>
+      <w:tr>
+        <w:tc>
+          <w:tcPr>
+            <w:tcW w:type="dxa" w:w="1944"/>
+            <w:tcMar>
+              <w:top w:w="80" w:type="dxa"/>
+              <w:start w:w="120" w:type="dxa"/>
+              <w:bottom w:w="80" w:type="dxa"/>
+              <w:end w:w="120" w:type="dxa"/>
+            </w:tcMar>
+            <w:tcBorders>
+              <w:top w:val="single" w:sz="6" w:space="0" w:color="D9E2EC"/>
+              <w:left w:val="single" w:sz="6" w:space="0" w:color="D9E2EC"/>
+              <w:bottom w:val="single" w:sz="6" w:space="0" w:color="D9E2EC"/>
+              <w:right w:val="single" w:sz="6" w:space="0" w:color="D9E2EC"/>
+            </w:tcBorders>
+          </w:tcPr>
+          <w:p>
+            <w:pPr>
+              <w:spacing w:before="0" w:after="0" w:line="276" w:lineRule="auto"/>
+            </w:pPr>
+            <w:r>
+              <w:rPr>
+                <w:rFonts w:ascii="Calibri" w:hAnsi="Calibri" w:eastAsia="Calibri"/>
+                <w:color w:val="1F2937"/>
+                <w:sz w:val="19"/>
+              </w:rPr>
+              <w:t>2026-07-12</w:t>
+            </w:r>
+          </w:p>
+        </w:tc>
+        <w:tc>
+          <w:tcPr>
+            <w:tcW w:type="dxa" w:w="7416"/>
+            <w:tcMar>
+              <w:top w:w="80" w:type="dxa"/>
+              <w:start w:w="120" w:type="dxa"/>
+              <w:bottom w:w="80" w:type="dxa"/>
+              <w:end w:w="120" w:type="dxa"/>
+            </w:tcMar>
+            <w:tcBorders>
+              <w:top w:val="single" w:sz="6" w:space="0" w:color="D9E2EC"/>
+              <w:left w:val="single" w:sz="6" w:space="0" w:color="D9E2EC"/>
+              <w:bottom w:val="single" w:sz="6" w:space="0" w:color="D9E2EC"/>
+              <w:right w:val="single" w:sz="6" w:space="0" w:color="D9E2EC"/>
+            </w:tcBorders>
+          </w:tcPr>
+          <w:p>
+            <w:pPr>
+              <w:spacing w:before="0" w:after="0" w:line="276" w:lineRule="auto"/>
+            </w:pPr>
+            <w:r>
+              <w:rPr>
+                <w:rFonts w:ascii="Calibri" w:hAnsi="Calibri" w:eastAsia="Calibri"/>
+                <w:color w:val="1F2937"/>
+                <w:sz w:val="19"/>
+              </w:rPr>
+              <w:t>Mengoptimasi performa backend: meningkatkan pg pool size ke 20, mengatasi bottleneck kueri N+1 pada produk via bulk fetch addons, mengimplementasi cache matriks otorisasi role, menggabungkan kueri statistik dashboard dengan CTE, mempercepat cold-start migrasi via check to_regclass, serta menambahkan masa berlaku pembayaran Snap 15 menit.</w:t>
             </w:r>
           </w:p>
         </w:tc>

</xml_diff>

<commit_message>
sec: implement rate limiting, password complexity validation, and Helmet CSP
</commit_message>
<xml_diff>
--- a/docs/FSD.docx
+++ b/docs/FSD.docx
@@ -1680,6 +1680,41 @@
         <w:pStyle w:val="Heading2"/>
       </w:pPr>
       <w:r>
+        <w:t>4.12 Keamanan Sistem</w:t>
+      </w:r>
+    </w:p>
+    <w:p>
+      <w:pPr>
+        <w:pStyle w:val="ListBullet"/>
+        <w:spacing w:before="0" w:after="80" w:line="300" w:lineRule="auto"/>
+      </w:pPr>
+      <w:r>
+        <w:t>Verifikasi Kekuatan Kata Sandi: Pengguna (pelanggan maupun kasir) wajib menggunakan kata sandi minimal 8 karakter dengan kombinasi huruf besar, huruf kecil, angka, dan simbol khusus.</w:t>
+      </w:r>
+    </w:p>
+    <w:p>
+      <w:pPr>
+        <w:pStyle w:val="ListBullet"/>
+        <w:spacing w:before="0" w:after="80" w:line="300" w:lineRule="auto"/>
+      </w:pPr>
+      <w:r>
+        <w:t>Pembatasan Percobaan Login (Rate Limiting): Setiap IP dibatasi maksimal 5 kali request login/registrasi per 15 menit. Jika dilanggar, server mengembalikan respons HTTP 429.</w:t>
+      </w:r>
+    </w:p>
+    <w:p>
+      <w:pPr>
+        <w:pStyle w:val="ListBullet"/>
+        <w:spacing w:before="0" w:after="80" w:line="300" w:lineRule="auto"/>
+      </w:pPr>
+      <w:r>
+        <w:t>Kebijakan Keamanan Konten (CSP): Mengaktifkan CSP melalui Helmet untuk mencegah eksekusi script luar yang tidak sah, dengan tetap mengizinkan fungsi pembayaran online Midtrans Snap.</w:t>
+      </w:r>
+    </w:p>
+    <w:p>
+      <w:pPr>
+        <w:pStyle w:val="Heading2"/>
+      </w:pPr>
+      <w:r>
         <w:t>4.12 Mode Development Lokal</w:t>
       </w:r>
     </w:p>
@@ -1935,6 +1970,68 @@
                 <w:sz w:val="19"/>
               </w:rPr>
               <w:t>Perubahan</w:t>
+            </w:r>
+          </w:p>
+        </w:tc>
+      </w:tr>
+      <w:tr>
+        <w:tc>
+          <w:tcPr>
+            <w:tcW w:type="dxa" w:w="1944"/>
+            <w:tcMar>
+              <w:top w:w="80" w:type="dxa"/>
+              <w:start w:w="120" w:type="dxa"/>
+              <w:bottom w:w="80" w:type="dxa"/>
+              <w:end w:w="120" w:type="dxa"/>
+            </w:tcMar>
+            <w:tcBorders>
+              <w:top w:val="single" w:sz="6" w:space="0" w:color="D9E2EC"/>
+              <w:left w:val="single" w:sz="6" w:space="0" w:color="D9E2EC"/>
+              <w:bottom w:val="single" w:sz="6" w:space="0" w:color="D9E2EC"/>
+              <w:right w:val="single" w:sz="6" w:space="0" w:color="D9E2EC"/>
+            </w:tcBorders>
+          </w:tcPr>
+          <w:p>
+            <w:pPr>
+              <w:spacing w:before="0" w:after="0" w:line="276" w:lineRule="auto"/>
+            </w:pPr>
+            <w:r>
+              <w:rPr>
+                <w:rFonts w:ascii="Calibri" w:hAnsi="Calibri" w:eastAsia="Calibri"/>
+                <w:color w:val="1F2937"/>
+                <w:sz w:val="19"/>
+              </w:rPr>
+              <w:t>2026-07-12</w:t>
+            </w:r>
+          </w:p>
+        </w:tc>
+        <w:tc>
+          <w:tcPr>
+            <w:tcW w:type="dxa" w:w="7416"/>
+            <w:tcMar>
+              <w:top w:w="80" w:type="dxa"/>
+              <w:start w:w="120" w:type="dxa"/>
+              <w:bottom w:w="80" w:type="dxa"/>
+              <w:end w:w="120" w:type="dxa"/>
+            </w:tcMar>
+            <w:tcBorders>
+              <w:top w:val="single" w:sz="6" w:space="0" w:color="D9E2EC"/>
+              <w:left w:val="single" w:sz="6" w:space="0" w:color="D9E2EC"/>
+              <w:bottom w:val="single" w:sz="6" w:space="0" w:color="D9E2EC"/>
+              <w:right w:val="single" w:sz="6" w:space="0" w:color="D9E2EC"/>
+            </w:tcBorders>
+          </w:tcPr>
+          <w:p>
+            <w:pPr>
+              <w:spacing w:before="0" w:after="0" w:line="276" w:lineRule="auto"/>
+            </w:pPr>
+            <w:r>
+              <w:rPr>
+                <w:rFonts w:ascii="Calibri" w:hAnsi="Calibri" w:eastAsia="Calibri"/>
+                <w:color w:val="1F2937"/>
+                <w:sz w:val="19"/>
+              </w:rPr>
+              <w:t>Meningkatkan keamanan web: menambahkan in-memory rate limiter untuk login/register, menerapkan validasi kekuatan kata sandi (huruf besar/kecil, angka, simbol), dan mengonfigurasi Content Security Policy (CSP) pada Helmet.</w:t>
             </w:r>
           </w:p>
         </w:tc>

</xml_diff>

<commit_message>
feat: replace native outlet select with custom dropdown & update docs
</commit_message>
<xml_diff>
--- a/docs/FSD.docx
+++ b/docs/FSD.docx
@@ -2031,6 +2031,68 @@
                 <w:color w:val="1F2937"/>
                 <w:sz w:val="19"/>
               </w:rPr>
+              <w:t>Mengganti pemilih outlet bawaan browser dengan komponen dropdown kustom (OutletSelector) yang lebih interaktif dan premium di storefront, manager, dan cashier.</w:t>
+            </w:r>
+          </w:p>
+        </w:tc>
+      </w:tr>
+      <w:tr>
+        <w:tc>
+          <w:tcPr>
+            <w:tcW w:type="dxa" w:w="1944"/>
+            <w:tcMar>
+              <w:top w:w="80" w:type="dxa"/>
+              <w:start w:w="120" w:type="dxa"/>
+              <w:bottom w:w="80" w:type="dxa"/>
+              <w:end w:w="120" w:type="dxa"/>
+            </w:tcMar>
+            <w:tcBorders>
+              <w:top w:val="single" w:sz="6" w:space="0" w:color="D9E2EC"/>
+              <w:left w:val="single" w:sz="6" w:space="0" w:color="D9E2EC"/>
+              <w:bottom w:val="single" w:sz="6" w:space="0" w:color="D9E2EC"/>
+              <w:right w:val="single" w:sz="6" w:space="0" w:color="D9E2EC"/>
+            </w:tcBorders>
+          </w:tcPr>
+          <w:p>
+            <w:pPr>
+              <w:spacing w:before="0" w:after="0" w:line="276" w:lineRule="auto"/>
+            </w:pPr>
+            <w:r>
+              <w:rPr>
+                <w:rFonts w:ascii="Calibri" w:hAnsi="Calibri" w:eastAsia="Calibri"/>
+                <w:color w:val="1F2937"/>
+                <w:sz w:val="19"/>
+              </w:rPr>
+              <w:t>2026-07-12</w:t>
+            </w:r>
+          </w:p>
+        </w:tc>
+        <w:tc>
+          <w:tcPr>
+            <w:tcW w:type="dxa" w:w="7416"/>
+            <w:tcMar>
+              <w:top w:w="80" w:type="dxa"/>
+              <w:start w:w="120" w:type="dxa"/>
+              <w:bottom w:w="80" w:type="dxa"/>
+              <w:end w:w="120" w:type="dxa"/>
+            </w:tcMar>
+            <w:tcBorders>
+              <w:top w:val="single" w:sz="6" w:space="0" w:color="D9E2EC"/>
+              <w:left w:val="single" w:sz="6" w:space="0" w:color="D9E2EC"/>
+              <w:bottom w:val="single" w:sz="6" w:space="0" w:color="D9E2EC"/>
+              <w:right w:val="single" w:sz="6" w:space="0" w:color="D9E2EC"/>
+            </w:tcBorders>
+          </w:tcPr>
+          <w:p>
+            <w:pPr>
+              <w:spacing w:before="0" w:after="0" w:line="276" w:lineRule="auto"/>
+            </w:pPr>
+            <w:r>
+              <w:rPr>
+                <w:rFonts w:ascii="Calibri" w:hAnsi="Calibri" w:eastAsia="Calibri"/>
+                <w:color w:val="1F2937"/>
+                <w:sz w:val="19"/>
+              </w:rPr>
               <w:t>Meningkatkan keamanan web: menambahkan in-memory rate limiter untuk login/register, menerapkan validasi kekuatan kata sandi (huruf besar/kecil, angka, simbol), dan mengonfigurasi Content Security Policy (CSP) pada Helmet.</w:t>
             </w:r>
           </w:p>

</xml_diff>

<commit_message>
feat: implement multi-outlet support, payment integration, security enhancements, and bottleneck optimizations
</commit_message>
<xml_diff>
--- a/docs/FSD.docx
+++ b/docs/FSD.docx
@@ -1378,7 +1378,69 @@
         <w:pStyle w:val="Heading2"/>
       </w:pPr>
       <w:r>
-        <w:t>4.8 Inventory</w:t>
+        <w:t>4.8 Aplikasi Mobile Android</w:t>
+      </w:r>
+    </w:p>
+    <w:p>
+      <w:pPr>
+        <w:pStyle w:val="ListBullet"/>
+        <w:spacing w:before="0" w:after="80" w:line="300" w:lineRule="auto"/>
+      </w:pPr>
+      <w:r>
+        <w:t>Aplikasi web dikemas sebagai aplikasi Android melalui Capacitor tanpa menduplikasi frontend React/TypeScript.</w:t>
+      </w:r>
+    </w:p>
+    <w:p>
+      <w:pPr>
+        <w:pStyle w:val="ListBullet"/>
+        <w:spacing w:before="0" w:after="80" w:line="300" w:lineRule="auto"/>
+      </w:pPr>
+      <w:r>
+        <w:t>Pelanggan, Cashier, Manager, dan Admin memakai fitur serta role yang sama seperti versi web.</w:t>
+      </w:r>
+    </w:p>
+    <w:p>
+      <w:pPr>
+        <w:pStyle w:val="ListBullet"/>
+        <w:spacing w:before="0" w:after="80" w:line="300" w:lineRule="auto"/>
+      </w:pPr>
+      <w:r>
+        <w:t>Aplikasi Android mengambil data dari VITE_API_BASE_URL. Emulator dapat memakai http://10.0.2.2:3001 untuk API lokal, perangkat fisik memakai IP LAN komputer, dan rilis publik memakai backend HTTPS.</w:t>
+      </w:r>
+    </w:p>
+    <w:p>
+      <w:pPr>
+        <w:pStyle w:val="ListBullet"/>
+        <w:spacing w:before="0" w:after="80" w:line="300" w:lineRule="auto"/>
+      </w:pPr>
+      <w:r>
+        <w:t>Status bar, splash screen, safe area, dan target sentuh disesuaikan untuk perangkat mobile.</w:t>
+      </w:r>
+    </w:p>
+    <w:p>
+      <w:pPr>
+        <w:pStyle w:val="ListBullet"/>
+        <w:spacing w:before="0" w:after="80" w:line="300" w:lineRule="auto"/>
+      </w:pPr>
+      <w:r>
+        <w:t>Pembayaran online dan WhatsApp dibuka melalui browser perangkat; status pembayaran dan pesanan tetap dipantau dari aplikasi.</w:t>
+      </w:r>
+    </w:p>
+    <w:p>
+      <w:pPr>
+        <w:pStyle w:val="ListBullet"/>
+        <w:spacing w:before="0" w:after="80" w:line="300" w:lineRule="auto"/>
+      </w:pPr>
+      <w:r>
+        <w:t>API hanya menerima origin native yang terdaftar pada MOBILE_ALLOWED_ORIGINS.</w:t>
+      </w:r>
+    </w:p>
+    <w:p>
+      <w:pPr>
+        <w:pStyle w:val="Heading2"/>
+      </w:pPr>
+      <w:r>
+        <w:t>4.9 Inventory</w:t>
       </w:r>
     </w:p>
     <w:p>
@@ -1449,7 +1511,7 @@
         <w:pStyle w:val="Heading2"/>
       </w:pPr>
       <w:r>
-        <w:t>4.9 Report Operasional dan Keuangan</w:t>
+        <w:t>4.10 Report Operasional dan Keuangan</w:t>
       </w:r>
     </w:p>
     <w:p>
@@ -1493,7 +1555,7 @@
         <w:pStyle w:val="Heading2"/>
       </w:pPr>
       <w:r>
-        <w:t>4.10 Manager dan Admin</w:t>
+        <w:t>4.11 Manager dan Admin</w:t>
       </w:r>
     </w:p>
     <w:p>
@@ -1609,7 +1671,7 @@
         <w:pStyle w:val="Heading2"/>
       </w:pPr>
       <w:r>
-        <w:t>4.11 RBAC Modul</w:t>
+        <w:t>4.12 RBAC Modul</w:t>
       </w:r>
     </w:p>
     <w:p>
@@ -1680,7 +1742,7 @@
         <w:pStyle w:val="Heading2"/>
       </w:pPr>
       <w:r>
-        <w:t>4.12 Keamanan Sistem</w:t>
+        <w:t>4.13 Keamanan Sistem</w:t>
       </w:r>
     </w:p>
     <w:p>
@@ -1715,7 +1777,7 @@
         <w:pStyle w:val="Heading2"/>
       </w:pPr>
       <w:r>
-        <w:t>4.12 Mode Development Lokal</w:t>
+        <w:t>4.14 Mode Development Lokal</w:t>
       </w:r>
     </w:p>
     <w:p>
@@ -1777,7 +1839,7 @@
         <w:pStyle w:val="Heading2"/>
       </w:pPr>
       <w:r>
-        <w:t>4.13 Hosting Publik Opsional</w:t>
+        <w:t>4.15 Hosting Publik Opsional</w:t>
       </w:r>
     </w:p>
     <w:p>
@@ -1970,6 +2032,68 @@
                 <w:sz w:val="19"/>
               </w:rPr>
               <w:t>Perubahan</w:t>
+            </w:r>
+          </w:p>
+        </w:tc>
+      </w:tr>
+      <w:tr>
+        <w:tc>
+          <w:tcPr>
+            <w:tcW w:type="dxa" w:w="1944"/>
+            <w:tcMar>
+              <w:top w:w="80" w:type="dxa"/>
+              <w:start w:w="120" w:type="dxa"/>
+              <w:bottom w:w="80" w:type="dxa"/>
+              <w:end w:w="120" w:type="dxa"/>
+            </w:tcMar>
+            <w:tcBorders>
+              <w:top w:val="single" w:sz="6" w:space="0" w:color="D9E2EC"/>
+              <w:left w:val="single" w:sz="6" w:space="0" w:color="D9E2EC"/>
+              <w:bottom w:val="single" w:sz="6" w:space="0" w:color="D9E2EC"/>
+              <w:right w:val="single" w:sz="6" w:space="0" w:color="D9E2EC"/>
+            </w:tcBorders>
+          </w:tcPr>
+          <w:p>
+            <w:pPr>
+              <w:spacing w:before="0" w:after="0" w:line="276" w:lineRule="auto"/>
+            </w:pPr>
+            <w:r>
+              <w:rPr>
+                <w:rFonts w:ascii="Calibri" w:hAnsi="Calibri" w:eastAsia="Calibri"/>
+                <w:color w:val="1F2937"/>
+                <w:sz w:val="19"/>
+              </w:rPr>
+              <w:t>2026-07-12</w:t>
+            </w:r>
+          </w:p>
+        </w:tc>
+        <w:tc>
+          <w:tcPr>
+            <w:tcW w:type="dxa" w:w="7416"/>
+            <w:tcMar>
+              <w:top w:w="80" w:type="dxa"/>
+              <w:start w:w="120" w:type="dxa"/>
+              <w:bottom w:w="80" w:type="dxa"/>
+              <w:end w:w="120" w:type="dxa"/>
+            </w:tcMar>
+            <w:tcBorders>
+              <w:top w:val="single" w:sz="6" w:space="0" w:color="D9E2EC"/>
+              <w:left w:val="single" w:sz="6" w:space="0" w:color="D9E2EC"/>
+              <w:bottom w:val="single" w:sz="6" w:space="0" w:color="D9E2EC"/>
+              <w:right w:val="single" w:sz="6" w:space="0" w:color="D9E2EC"/>
+            </w:tcBorders>
+          </w:tcPr>
+          <w:p>
+            <w:pPr>
+              <w:spacing w:before="0" w:after="0" w:line="276" w:lineRule="auto"/>
+            </w:pPr>
+            <w:r>
+              <w:rPr>
+                <w:rFonts w:ascii="Calibri" w:hAnsi="Calibri" w:eastAsia="Calibri"/>
+                <w:color w:val="1F2937"/>
+                <w:sz w:val="19"/>
+              </w:rPr>
+              <w:t>Menambahkan aplikasi Android berbasis Capacitor, konfigurasi API mobile, integrasi browser pembayaran/WhatsApp, status bar, splash screen, safe area, dan perintah build native.</w:t>
             </w:r>
           </w:p>
         </w:tc>

</xml_diff>